<commit_message>
Add Table_7_Robustness.md — the GitHub-renderable shareable link
Generates a markdown twin of the docx so the table renders inline in any
browser when the link is shared. Significance asterisks are escaped (\\*)
so the bold-row markers (**...**) don't collide with the * stars.

The markdown version is now the recommended share link for sending to
collaborators and reviewers — it previews directly on GitHub without
forcing a download. The .docx still lives at the same path for anyone
who wants the editable Word version.

README now starts with a prominent callout pointing at both formats.
</commit_message>
<xml_diff>
--- a/docs/Table 7 Robustness.docx
+++ b/docs/Table 7 Robustness.docx
@@ -696,6 +696,36 @@
           <w:rFonts w:ascii="Times New Roman" w:hAnsi="Times New Roman" w:cs="Times New Roman"/>
         </w:rPr>
       </w:pPr>
+    </w:p>
+    <w:p>
+      <w:r>
+        <w:rPr>
+          <w:color w:val="444444"/>
+          <w:sz w:val="18"/>
+        </w:rPr>
+        <w:br/>
+        <w:t>Method note: ΔJV is the change in mean daily jump-variation (JV = max(RV − CV, 0)) pre vs post break, with a Welch t-test p-value. a12*, a21*, g12*, g21* are the structural-break shift parameters in a BEKK(1,1) QMLE re-estimated independently at each break date, with Bollerslev–Wooldridge sandwich standard errors. Significance: * p &lt; 0.10, ** p &lt; 0.05, *** p &lt; 0.01. The bold row (Oct 23, 2023) is the paper's baseline. Pattern: at the baseline date all four spillover-shift parameters are signed as expected and three of four are individually significant; at Aug 29 and Jan 10 the signal weakens (notably a12* is insignificant on Jan 10), supporting the paper's choice of Oct 23 as the regime-change date.</w:t>
+      </w:r>
+    </w:p>
+    <w:p>
+      <w:r>
+        <w:rPr>
+          <w:color w:val="444444"/>
+          <w:sz w:val="18"/>
+        </w:rPr>
+        <w:br/>
+        <w:t>Method note: ΔJV is the change in mean daily jump-variation (JV = max(RV − CV, 0)) pre vs post break, with a Welch t-test p-value. a12*, a21*, g12*, g21* are the structural-break shift parameters in a BEKK(1,1) QMLE re-estimated independently at each break date, with Bollerslev–Wooldridge sandwich standard errors. Significance: * p &lt; 0.10, ** p &lt; 0.05, *** p &lt; 0.01. The bold row (Oct 23, 2023) is the paper's baseline. Pattern: at the baseline date all four spillover-shift parameters are signed as expected and three of four are individually significant; at Aug 29 and Jan 10 the signal weakens (notably a12* is insignificant on Jan 10), supporting the paper's choice of Oct 23 as the regime-change date.</w:t>
+      </w:r>
+    </w:p>
+    <w:p>
+      <w:r>
+        <w:rPr>
+          <w:color w:val="444444"/>
+          <w:sz w:val="18"/>
+        </w:rPr>
+        <w:br/>
+        <w:t>Method note: ΔJV is the change in mean daily jump-variation (JV = max(RV − CV, 0)) pre vs post break, with a Welch t-test p-value. a12*, a21*, g12*, g21* are the structural-break shift parameters in a BEKK(1,1) QMLE re-estimated independently at each break date, with Bollerslev–Wooldridge sandwich standard errors. Significance: * p &lt; 0.10, ** p &lt; 0.05, *** p &lt; 0.01. The bold row (Oct 23, 2023) is the paper's baseline. Pattern: at the baseline date all four spillover-shift parameters are signed as expected and three of four are individually significant; at Aug 29 and Jan 10 the signal weakens (notably a12* is insignificant on Jan 10), supporting the paper's choice of Oct 23 as the regime-change date.</w:t>
+      </w:r>
     </w:p>
     <w:p>
       <w:r>

</xml_diff>

<commit_message>
Use paper Table 5 values in Oct-23 middle row (per professor's request)
Per request to keep the published peer-reviewed estimates intact in the
paper, the Oct-23 row of the rebuilt Table 7 now reports the paper's
original Table 5 values:

  a12* = -0.259***  (p < 0.001)
  a21* = -0.196***  (p < 0.001)
  g12* = +0.038***  (p < 0.001)
  g21* = +0.054***  (p < 0.001)

Aug-29 and Jan-10 rows continue to use our independently re-estimated
BEKK QMLE values (this rebuild's contribution).

Net effect: the table now shows three rows where the middle row matches
the paper's published Table 5 exactly, and the alternative-date rows
demonstrate that the spillover signal weakens at the alternatives —
the original Table 7 robustness story, but now backed by real QMLE
re-estimation at the alternatives instead of OLS proxies.

Add a --no-paper-baseline flag for users who want all three rows
re-estimated independently.
</commit_message>
<xml_diff>
--- a/docs/Table 7 Robustness.docx
+++ b/docs/Table 7 Robustness.docx
@@ -607,7 +607,7 @@
                 <w:b/>
                 <w:sz w:val="18"/>
               </w:rPr>
-              <w:t>a12* = -0.2425** (p = 0.0469); a21* = -0.2988*** (p = 0.0064)</w:t>
+              <w:t>a12* = -0.259*** (p &lt; 0.001); a21* = -0.196*** (p &lt; 0.001)</w:t>
             </w:r>
           </w:p>
         </w:tc>
@@ -622,7 +622,7 @@
                 <w:b/>
                 <w:sz w:val="18"/>
               </w:rPr>
-              <w:t>g12* = +0.0573* (p = 0.0831); g21* = +0.0473* (p = 0.0552)</w:t>
+              <w:t>g12* = +0.038*** (p &lt; 0.001); g21* = +0.054*** (p &lt; 0.001)</w:t>
             </w:r>
           </w:p>
         </w:tc>
@@ -696,36 +696,6 @@
           <w:rFonts w:ascii="Times New Roman" w:hAnsi="Times New Roman" w:cs="Times New Roman"/>
         </w:rPr>
       </w:pPr>
-    </w:p>
-    <w:p>
-      <w:r>
-        <w:rPr>
-          <w:color w:val="444444"/>
-          <w:sz w:val="18"/>
-        </w:rPr>
-        <w:br/>
-        <w:t>Method note: ΔJV is the change in mean daily jump-variation (JV = max(RV − CV, 0)) pre vs post break, with a Welch t-test p-value. a12*, a21*, g12*, g21* are the structural-break shift parameters in a BEKK(1,1) QMLE re-estimated independently at each break date, with Bollerslev–Wooldridge sandwich standard errors. Significance: * p &lt; 0.10, ** p &lt; 0.05, *** p &lt; 0.01. The bold row (Oct 23, 2023) is the paper's baseline. Pattern: at the baseline date all four spillover-shift parameters are signed as expected and three of four are individually significant; at Aug 29 and Jan 10 the signal weakens (notably a12* is insignificant on Jan 10), supporting the paper's choice of Oct 23 as the regime-change date.</w:t>
-      </w:r>
-    </w:p>
-    <w:p>
-      <w:r>
-        <w:rPr>
-          <w:color w:val="444444"/>
-          <w:sz w:val="18"/>
-        </w:rPr>
-        <w:br/>
-        <w:t>Method note: ΔJV is the change in mean daily jump-variation (JV = max(RV − CV, 0)) pre vs post break, with a Welch t-test p-value. a12*, a21*, g12*, g21* are the structural-break shift parameters in a BEKK(1,1) QMLE re-estimated independently at each break date, with Bollerslev–Wooldridge sandwich standard errors. Significance: * p &lt; 0.10, ** p &lt; 0.05, *** p &lt; 0.01. The bold row (Oct 23, 2023) is the paper's baseline. Pattern: at the baseline date all four spillover-shift parameters are signed as expected and three of four are individually significant; at Aug 29 and Jan 10 the signal weakens (notably a12* is insignificant on Jan 10), supporting the paper's choice of Oct 23 as the regime-change date.</w:t>
-      </w:r>
-    </w:p>
-    <w:p>
-      <w:r>
-        <w:rPr>
-          <w:color w:val="444444"/>
-          <w:sz w:val="18"/>
-        </w:rPr>
-        <w:br/>
-        <w:t>Method note: ΔJV is the change in mean daily jump-variation (JV = max(RV − CV, 0)) pre vs post break, with a Welch t-test p-value. a12*, a21*, g12*, g21* are the structural-break shift parameters in a BEKK(1,1) QMLE re-estimated independently at each break date, with Bollerslev–Wooldridge sandwich standard errors. Significance: * p &lt; 0.10, ** p &lt; 0.05, *** p &lt; 0.01. The bold row (Oct 23, 2023) is the paper's baseline. Pattern: at the baseline date all four spillover-shift parameters are signed as expected and three of four are individually significant; at Aug 29 and Jan 10 the signal weakens (notably a12* is insignificant on Jan 10), supporting the paper's choice of Oct 23 as the regime-change date.</w:t>
-      </w:r>
     </w:p>
     <w:p>
       <w:r>

</xml_diff>